<commit_message>
Focus training-transfer venture on 50-person businesses and add experience cases
</commit_message>
<xml_diff>
--- a/pitch/2026-bronco-entrepreneur-challenge/employee-development-summary.docx
+++ b/pitch/2026-bronco-entrepreneur-challenge/employee-development-summary.docx
@@ -7,7 +7,7 @@
         <w:pStyle w:val="Title"/>
       </w:pPr>
       <w:r>
-        <w:t>Practical Employee Development</w:t>
+        <w:t>Training to Results</w:t>
       </w:r>
     </w:p>
     <w:p>
@@ -23,12 +23,12 @@
         <w:pStyle w:val="Heading1"/>
       </w:pPr>
       <w:r>
-        <w:t>Customer and problem</w:t>
+        <w:t>Customer and buying trigger</w:t>
       </w:r>
     </w:p>
     <w:p>
       <w:r>
-        <w:t>Our initial customer is an owner or operations leader at a growing small or medium business with recurring employee roles, no dedicated training department, and limited HR support. The first problem to investigate is repeated manager coaching during onboarding: employees receive explanations but still struggle to perform critical tasks independently. Owners, supervisors, and employees would each participate; the owner or operations leader would authorize the purchase.</w:t>
+        <w:t>The initial customer is an owner or operations leader at a business with about 50 employees, one HR generalist, and perhaps a recruiter or designated trainer, but no substantial training department. The buying trigger is one costly, recurring job-performance failure that existing training has not resolved. The business must have a subject matter expert and supervisor available to help define and test successful work.</w:t>
       </w:r>
     </w:p>
     <w:p>
@@ -36,12 +36,12 @@
         <w:pStyle w:val="Heading1"/>
       </w:pPr>
       <w:r>
-        <w:t>Service and delivery</w:t>
+        <w:t>Offer and delivery</w:t>
       </w:r>
     </w:p>
     <w:p>
       <w:r>
-        <w:t>Practical Employee Development is a consulting service that starts with one role and one performance problem. A diagnostic defines successful work, examines the cause of the gap, and recommends whether training, a clearer process, or another change is needed. A subsequent implementation project can combine job aids, worked examples, realistic practice, and supervisor follow-up using the customer's existing tools. Narrative lessons are one delivery option.</w:t>
+        <w:t>Start with the highest-priority problem that is measurable and feasible to address. A diagnostic defines the required result and checks whether the cause is a skill gap, a process or tool problem, or another barrier. If training is appropriate, a separately scoped pilot combines expert knowledge, practice on real work, performance aids, and supervisor follow-up. AI can assist capture and drafting; the client expert validates accuracy and performance standards.</w:t>
       </w:r>
     </w:p>
     <w:p>
@@ -54,7 +54,7 @@
     </w:p>
     <w:p>
       <w:r>
-        <w:t>The primary benefit is less dependence on repeated supervisor coaching. Each pilot would establish a baseline and measure coaching hours, time to independent work, or rework. For scale, five supervisor hours per week at an assumed $50 per hour over 50 weeks represents $12,500 of annual time cost. This is an illustrative scenario, not an observed customer loss or a promised saving.</w:t>
+        <w:t>The intended benefit is better job performance that helps protect or generate revenue, reduce rework, or free supervisor time. Agree a baseline, observable performance standard, and follow-up measure before building the intervention. Revenue or hiring outcomes require their own evidence; successful task completion is an intermediate result. Each engagement starts with one problem and can expand after results are reviewed.</w:t>
       </w:r>
     </w:p>
     <w:p>
@@ -62,12 +62,12 @@
         <w:pStyle w:val="Heading1"/>
       </w:pPr>
       <w:r>
-        <w:t>Payment and competition</w:t>
+        <w:t>Relevant results and experience</w:t>
       </w:r>
     </w:p>
     <w:p>
       <w:r>
-        <w:t>The initial pricing hypothesis is a $1,450 fixed-price diagnostic for one role and one problem, with a 10-18-hour internal effort budget. Implementation would be quoted separately after scope is clear. Alternatives include managers training informally, SOP and training platforms such as Trainual, and operations or learning consultants. Our proposed focus is affordable, hands-on diagnosis and implementation for a business building its first training function. Buyer interviews must establish whether that focus is valuable.</w:t>
+        <w:t>Charles Warloe holds a master's degree in Instructional Design and Technology and has corporate and military training experience. He reports designing a six-hour recruiting program whose initial six-person pilot used live requisitions: all six met the objective of sourcing five additional qualified candidates in a one-hour assessment. He also reports successful subsequent in-person and online delivery. At Doxa Painting, he worked with two founders to codify successful work and build interview assessments, competency checks, and training; a founder developed critical-skill job sheets and standards.</w:t>
       </w:r>
     </w:p>
     <w:p>
@@ -75,12 +75,12 @@
         <w:pStyle w:val="Heading1"/>
       </w:pPr>
       <w:r>
-        <w:t>Founder, progress, and next test</w:t>
+        <w:t>Business model and next validation</w:t>
       </w:r>
     </w:p>
     <w:p>
       <w:r>
-        <w:t>Charles Warloe holds a master's degree in Instructional Design and Technology and has experience in corporate and military training. His employee work at Doxa Painting included development tools, skills standards, and operational reporting. A later Skis consulting proposal was not implemented. These experiences support delivery capability; they do not establish demand for this new offer. The next test is customer interviews followed by a review of one sample workflow, seeking a buyer willing to scope a paid pilot.</w:t>
+        <w:t>The pricing hypothesis is a $1,450 diagnostic for one role and one problem, with implementation quoted separately. Alternatives include internal trainers, training platforms, and performance consultants. The proposed focus is hands-on implementation for a business with limited training capacity, informed by established training-transfer methods. Historical results are founder-reported, and the Doxa work was as an employee. Next: corroborate the case details, interview buyers near the target size, and scope one paid pilot.</w:t>
       </w:r>
     </w:p>
     <w:sectPr>

</xml_diff>